<commit_message>
Uploading Project Images & Daily Log
</commit_message>
<xml_diff>
--- a/LOGS.docx
+++ b/LOGS.docx
@@ -64,21 +64,7 @@
         <w:rPr>
           <w:lang w:val="en-US"/>
         </w:rPr>
-        <w:t xml:space="preserve">Made the </w:t>
-      </w:r>
-      <w:proofErr w:type="gramStart"/>
-      <w:r>
-        <w:rPr>
-          <w:lang w:val="en-US"/>
-        </w:rPr>
-        <w:t>full on</w:t>
-      </w:r>
-      <w:proofErr w:type="gramEnd"/>
-      <w:r>
-        <w:rPr>
-          <w:lang w:val="en-US"/>
-        </w:rPr>
-        <w:t xml:space="preserve"> irrigation system physical box. </w:t>
+        <w:t xml:space="preserve">Made the full on irrigation system physical box. </w:t>
       </w:r>
     </w:p>
     <w:p>
@@ -127,7 +113,6 @@
         <w:t xml:space="preserve">, but I kept hitting a </w:t>
       </w:r>
       <w:proofErr w:type="spellStart"/>
-      <w:proofErr w:type="gramStart"/>
       <w:r>
         <w:rPr>
           <w:lang w:val="en-US"/>
@@ -135,40 +120,11 @@
         <w:t>deadend</w:t>
       </w:r>
       <w:proofErr w:type="spellEnd"/>
-      <w:proofErr w:type="gramEnd"/>
-      <w:r>
-        <w:rPr>
-          <w:lang w:val="en-US"/>
-        </w:rPr>
-        <w:t xml:space="preserve">. I utilized another library called COM, which </w:t>
-      </w:r>
-      <w:proofErr w:type="gramStart"/>
-      <w:r>
-        <w:rPr>
-          <w:lang w:val="en-US"/>
-        </w:rPr>
-        <w:t>generate</w:t>
-      </w:r>
-      <w:proofErr w:type="gramEnd"/>
-      <w:r>
-        <w:rPr>
-          <w:lang w:val="en-US"/>
-        </w:rPr>
-        <w:t xml:space="preserve"> fake COMS ports in place of Bluetooth connections (such as ones that are BLE, low </w:t>
-      </w:r>
-      <w:proofErr w:type="gramStart"/>
-      <w:r>
-        <w:rPr>
-          <w:lang w:val="en-US"/>
-        </w:rPr>
-        <w:t>energy)  for</w:t>
-      </w:r>
-      <w:proofErr w:type="gramEnd"/>
-      <w:r>
-        <w:rPr>
-          <w:lang w:val="en-US"/>
-        </w:rPr>
-        <w:t xml:space="preserve"> which you should be able to connect to. But some compatibility issues on the drivers keep resulting in error. I decided to postpone the Bluetooth </w:t>
+      <w:r>
+        <w:rPr>
+          <w:lang w:val="en-US"/>
+        </w:rPr>
+        <w:t xml:space="preserve">. I utilized another library called COM, which generate fake COMS ports in place of Bluetooth connections (such as ones that are BLE, low energy)  for which you should be able to connect to. But some compatibility issues on the drivers keep resulting in error. I decided to postpone the Bluetooth </w:t>
       </w:r>
       <w:proofErr w:type="spellStart"/>
       <w:r>
@@ -214,21 +170,7 @@
         <w:rPr>
           <w:lang w:val="en-US"/>
         </w:rPr>
-        <w:t xml:space="preserve"> once every day </w:t>
-      </w:r>
-      <w:proofErr w:type="gramStart"/>
-      <w:r>
-        <w:rPr>
-          <w:lang w:val="en-US"/>
-        </w:rPr>
-        <w:t>for  3</w:t>
-      </w:r>
-      <w:proofErr w:type="gramEnd"/>
-      <w:r>
-        <w:rPr>
-          <w:lang w:val="en-US"/>
-        </w:rPr>
-        <w:t xml:space="preserve"> seconds. The plant is not taking any water yet, or as much as I am predicting, so I am playing conservative until I see some progress. </w:t>
+        <w:t xml:space="preserve"> once every day for  3 seconds. The plant is not taking any water yet, or as much as I am predicting, so I am playing conservative until I see some progress. </w:t>
       </w:r>
     </w:p>
     <w:p>
@@ -289,21 +231,7 @@
         <w:rPr>
           <w:lang w:val="en-US"/>
         </w:rPr>
-        <w:t xml:space="preserve">Humidity sensor value has not changed much despite 12 hours under growth light. Either soil or plant seeds are not “well”. Or they are over filled </w:t>
-      </w:r>
-      <w:proofErr w:type="gramStart"/>
-      <w:r>
-        <w:rPr>
-          <w:lang w:val="en-US"/>
-        </w:rPr>
-        <w:t>of</w:t>
-      </w:r>
-      <w:proofErr w:type="gramEnd"/>
-      <w:r>
-        <w:rPr>
-          <w:lang w:val="en-US"/>
-        </w:rPr>
-        <w:t xml:space="preserve"> water, drowning them. Or the plant is still growing but slowly. </w:t>
+        <w:t xml:space="preserve">Humidity sensor value has not changed much despite 12 hours under growth light. Either soil or plant seeds are not “well”. Or they are over filled of water, drowning them. Or the plant is still growing but slowly. </w:t>
       </w:r>
     </w:p>
     <w:p>
@@ -321,21 +249,7 @@
         <w:rPr>
           <w:lang w:val="en-US"/>
         </w:rPr>
-        <w:t xml:space="preserve">Plan is to keep manual watering over the next week, sticking to routine and waiting for any response. As plant lifecycle takes weeks, best o only </w:t>
-      </w:r>
-      <w:proofErr w:type="gramStart"/>
-      <w:r>
-        <w:rPr>
-          <w:lang w:val="en-US"/>
-        </w:rPr>
-        <w:t>alter</w:t>
-      </w:r>
-      <w:proofErr w:type="gramEnd"/>
-      <w:r>
-        <w:rPr>
-          <w:lang w:val="en-US"/>
-        </w:rPr>
-        <w:t xml:space="preserve"> changes after a week of results.</w:t>
+        <w:t>Plan is to keep manual watering over the next week, sticking to routine and waiting for any response. As plant lifecycle takes weeks, best o only alter changes after a week of results.</w:t>
       </w:r>
     </w:p>
     <w:p>
@@ -511,30 +425,17 @@
     </w:p>
     <w:p>
       <w:r>
-        <w:t xml:space="preserve">The one unresolved piece is the biological </w:t>
-      </w:r>
-      <w:proofErr w:type="gramStart"/>
-      <w:r>
-        <w:t>outcome</w:t>
+        <w:t>The one unresolved piece is the biological outcome</w:t>
       </w:r>
       <w:r>
         <w:t xml:space="preserve">, </w:t>
       </w:r>
       <w:r>
-        <w:t xml:space="preserve"> two</w:t>
-      </w:r>
-      <w:proofErr w:type="gramEnd"/>
-      <w:r>
-        <w:t xml:space="preserve"> growing attempts have stalled (first from oversaturation, second possibly from mold/airflow issues), and </w:t>
-      </w:r>
-      <w:r>
-        <w:t xml:space="preserve">I did </w:t>
-      </w:r>
-      <w:proofErr w:type="gramStart"/>
-      <w:r>
-        <w:t>an</w:t>
-      </w:r>
-      <w:proofErr w:type="gramEnd"/>
+        <w:t xml:space="preserve"> two growing attempts have stalled (first from oversaturation, second possibly from mold/airflow issues), and </w:t>
+      </w:r>
+      <w:r>
+        <w:t>I did an</w:t>
+      </w:r>
       <w:r>
         <w:t xml:space="preserve"> mid-restart with fresh soil, a fan, dual sensors, and a repositioned probe.</w:t>
       </w:r>
@@ -598,15 +499,7 @@
         </w:numPr>
       </w:pPr>
       <w:r>
-        <w:t xml:space="preserve">Two separate mislabeled-BLE-as-HC-05 hardware dead ends, including a deep, </w:t>
-      </w:r>
-      <w:proofErr w:type="gramStart"/>
-      <w:r>
-        <w:t>correctly-executed</w:t>
-      </w:r>
-      <w:proofErr w:type="gramEnd"/>
-      <w:r>
-        <w:t xml:space="preserve"> but ultimately unsuccessful Windows BLE-bridge attempt (</w:t>
+        <w:t>Two separate mislabeled-BLE-as-HC-05 hardware dead ends, including a deep, correctly-executed but ultimately unsuccessful Windows BLE-bridge attempt (</w:t>
       </w:r>
       <w:proofErr w:type="spellStart"/>
       <w:r>
@@ -697,6 +590,214 @@
         <w:rPr>
           <w:b/>
           <w:bCs/>
+          <w:lang w:val="en-US"/>
+        </w:rPr>
+      </w:pPr>
+    </w:p>
+    <w:p>
+      <w:pPr>
+        <w:rPr>
+          <w:b/>
+          <w:bCs/>
+          <w:color w:val="EE0000"/>
+          <w:lang w:val="en-US"/>
+        </w:rPr>
+      </w:pPr>
+      <w:r>
+        <w:rPr>
+          <w:b/>
+          <w:bCs/>
+          <w:color w:val="EE0000"/>
+          <w:lang w:val="en-US"/>
+        </w:rPr>
+        <w:t>11:46 Manual Watering with Pump, 3 seconds</w:t>
+      </w:r>
+    </w:p>
+    <w:p>
+      <w:pPr>
+        <w:rPr>
+          <w:b/>
+          <w:bCs/>
+          <w:color w:val="EE0000"/>
+          <w:lang w:val="en-US"/>
+        </w:rPr>
+      </w:pPr>
+    </w:p>
+    <w:p>
+      <w:pPr>
+        <w:rPr>
+          <w:b/>
+          <w:bCs/>
+          <w:color w:val="EE0000"/>
+          <w:lang w:val="en-US"/>
+        </w:rPr>
+      </w:pPr>
+    </w:p>
+    <w:p>
+      <w:pPr>
+        <w:rPr>
+          <w:b/>
+          <w:bCs/>
+          <w:color w:val="EE0000"/>
+          <w:lang w:val="en-US"/>
+        </w:rPr>
+      </w:pPr>
+    </w:p>
+    <w:p>
+      <w:pPr>
+        <w:rPr>
+          <w:b/>
+          <w:bCs/>
+          <w:lang w:val="en-US"/>
+        </w:rPr>
+      </w:pPr>
+      <w:r>
+        <w:rPr>
+          <w:b/>
+          <w:bCs/>
+          <w:lang w:val="en-US"/>
+        </w:rPr>
+        <w:t>1</w:t>
+      </w:r>
+      <w:r>
+        <w:rPr>
+          <w:b/>
+          <w:bCs/>
+          <w:lang w:val="en-US"/>
+        </w:rPr>
+        <w:t>3</w:t>
+      </w:r>
+      <w:r>
+        <w:rPr>
+          <w:b/>
+          <w:bCs/>
+          <w:lang w:val="en-US"/>
+        </w:rPr>
+        <w:t>/08/2026</w:t>
+      </w:r>
+    </w:p>
+    <w:p>
+      <w:pPr>
+        <w:pStyle w:val="ListParagraph"/>
+        <w:numPr>
+          <w:ilvl w:val="0"/>
+          <w:numId w:val="1"/>
+        </w:numPr>
+        <w:rPr>
+          <w:b/>
+          <w:bCs/>
+          <w:lang w:val="en-US"/>
+        </w:rPr>
+      </w:pPr>
+      <w:r>
+        <w:rPr>
+          <w:lang w:val="en-US"/>
+        </w:rPr>
+        <w:t xml:space="preserve">After watering it manually, I started seeing plant growth. Confirming, with a fan always on, mirrors around the corner the plant is in, growth lights </w:t>
+      </w:r>
+      <w:proofErr w:type="spellStart"/>
+      <w:r>
+        <w:rPr>
+          <w:lang w:val="en-US"/>
+        </w:rPr>
+        <w:t>ontop</w:t>
+      </w:r>
+      <w:proofErr w:type="spellEnd"/>
+      <w:r>
+        <w:rPr>
+          <w:lang w:val="en-US"/>
+        </w:rPr>
+        <w:t>, with an Arduino giving soil moisture values using sensors placed in the soil dirt at 2 different lengths to my laptop running ignition, and an water pump with its sr</w:t>
+      </w:r>
+      <w:proofErr w:type="spellStart"/>
+      <w:r>
+        <w:rPr>
+          <w:lang w:val="en-US"/>
+        </w:rPr>
+        <w:t>pout</w:t>
+      </w:r>
+      <w:proofErr w:type="spellEnd"/>
+      <w:r>
+        <w:rPr>
+          <w:lang w:val="en-US"/>
+        </w:rPr>
+        <w:t xml:space="preserve"> pointing to the bottom cup the yogurt container holding the plant within is in connected to a smart sensor.</w:t>
+      </w:r>
+    </w:p>
+    <w:p>
+      <w:pPr>
+        <w:pStyle w:val="ListParagraph"/>
+        <w:numPr>
+          <w:ilvl w:val="0"/>
+          <w:numId w:val="1"/>
+        </w:numPr>
+        <w:rPr>
+          <w:b/>
+          <w:bCs/>
+          <w:lang w:val="en-US"/>
+        </w:rPr>
+      </w:pPr>
+      <w:r>
+        <w:rPr>
+          <w:lang w:val="en-US"/>
+        </w:rPr>
+        <w:t>Plant growth</w:t>
+      </w:r>
+    </w:p>
+    <w:p>
+      <w:pPr>
+        <w:pStyle w:val="ListParagraph"/>
+        <w:numPr>
+          <w:ilvl w:val="0"/>
+          <w:numId w:val="1"/>
+        </w:numPr>
+        <w:rPr>
+          <w:b/>
+          <w:bCs/>
+          <w:lang w:val="en-US"/>
+        </w:rPr>
+      </w:pPr>
+      <w:r>
+        <w:rPr>
+          <w:lang w:val="en-US"/>
+        </w:rPr>
+        <w:t xml:space="preserve">My database was no longer collecting values, as before I purge the database after taking a backup. It contained values throughout the numerous debugging and troubleshooting done and were not the values needed for this project. But in doing so, I wanted two separate columns for date and time, and due to JDBC data types mismatch for date values with </w:t>
+      </w:r>
+      <w:proofErr w:type="spellStart"/>
+      <w:r>
+        <w:rPr>
+          <w:lang w:val="en-US"/>
+        </w:rPr>
+        <w:t>postGreSQL</w:t>
+      </w:r>
+      <w:proofErr w:type="spellEnd"/>
+      <w:r>
+        <w:rPr>
+          <w:lang w:val="en-US"/>
+        </w:rPr>
+        <w:t xml:space="preserve">, I have to upload a script to account for that mismatch so I can give successful uploads to my </w:t>
+      </w:r>
+      <w:proofErr w:type="spellStart"/>
+      <w:r>
+        <w:rPr>
+          <w:lang w:val="en-US"/>
+        </w:rPr>
+        <w:t>PostgresSQL</w:t>
+      </w:r>
+      <w:proofErr w:type="spellEnd"/>
+      <w:r>
+        <w:rPr>
+          <w:lang w:val="en-US"/>
+        </w:rPr>
+        <w:t xml:space="preserve"> DB and I can get the water moisture values, date, time, for both soil depths every 5 minutes as wanted. </w:t>
+      </w:r>
+    </w:p>
+    <w:p>
+      <w:pPr>
+        <w:rPr>
+          <w:b/>
+          <w:bCs/>
+          <w:color w:val="EE0000"/>
           <w:lang w:val="en-US"/>
         </w:rPr>
       </w:pPr>
@@ -1383,6 +1484,7 @@
   <w:style w:type="paragraph" w:default="1" w:styleId="Normal">
     <w:name w:val="Normal"/>
     <w:qFormat/>
+    <w:rsid w:val="0026499A"/>
   </w:style>
   <w:style w:type="paragraph" w:styleId="Heading1">
     <w:name w:val="heading 1"/>
@@ -1586,6 +1688,7 @@
   <w:style w:type="character" w:default="1" w:styleId="DefaultParagraphFont">
     <w:name w:val="Default Paragraph Font"/>
     <w:uiPriority w:val="1"/>
+    <w:semiHidden/>
     <w:unhideWhenUsed/>
   </w:style>
   <w:style w:type="table" w:default="1" w:styleId="TableNormal">

</xml_diff>

<commit_message>
Adding Images of Project
Updating log and adding images. Ignition Dashboard, ModBus poll testing.
</commit_message>
<xml_diff>
--- a/LOGS.docx
+++ b/LOGS.docx
@@ -707,14 +707,14 @@
         <w:rPr>
           <w:lang w:val="en-US"/>
         </w:rPr>
-        <w:t>, with an Arduino giving soil moisture values using sensors placed in the soil dirt at 2 different lengths to my laptop running ignition, and an water pump with its sr</w:t>
+        <w:t xml:space="preserve">, with an Arduino giving soil moisture values using sensors placed in the soil dirt at 2 different lengths to my laptop running ignition, and an water pump with its </w:t>
       </w:r>
       <w:proofErr w:type="spellStart"/>
       <w:r>
         <w:rPr>
           <w:lang w:val="en-US"/>
         </w:rPr>
-        <w:t>pout</w:t>
+        <w:t>srpout</w:t>
       </w:r>
       <w:proofErr w:type="spellEnd"/>
       <w:r>
@@ -790,6 +790,121 @@
           <w:lang w:val="en-US"/>
         </w:rPr>
         <w:t xml:space="preserve"> DB and I can get the water moisture values, date, time, for both soil depths every 5 minutes as wanted. </w:t>
+      </w:r>
+    </w:p>
+    <w:p>
+      <w:pPr>
+        <w:rPr>
+          <w:b/>
+          <w:bCs/>
+          <w:lang w:val="en-US"/>
+        </w:rPr>
+      </w:pPr>
+    </w:p>
+    <w:p>
+      <w:pPr>
+        <w:rPr>
+          <w:b/>
+          <w:bCs/>
+          <w:lang w:val="en-US"/>
+        </w:rPr>
+      </w:pPr>
+    </w:p>
+    <w:p>
+      <w:pPr>
+        <w:rPr>
+          <w:b/>
+          <w:bCs/>
+          <w:lang w:val="en-US"/>
+        </w:rPr>
+      </w:pPr>
+      <w:r>
+        <w:rPr>
+          <w:b/>
+          <w:bCs/>
+          <w:lang w:val="en-US"/>
+        </w:rPr>
+        <w:t>At 8pm</w:t>
+      </w:r>
+    </w:p>
+    <w:p>
+      <w:pPr>
+        <w:rPr>
+          <w:lang w:val="en-US"/>
+        </w:rPr>
+      </w:pPr>
+      <w:r>
+        <w:rPr>
+          <w:lang w:val="en-US"/>
+        </w:rPr>
+        <w:t xml:space="preserve">I have plant growth finally, so the system is working. </w:t>
+      </w:r>
+    </w:p>
+    <w:p>
+      <w:pPr>
+        <w:rPr>
+          <w:lang w:val="en-US"/>
+        </w:rPr>
+      </w:pPr>
+      <w:r>
+        <w:rPr>
+          <w:lang w:val="en-US"/>
+        </w:rPr>
+        <w:t xml:space="preserve">A constant fan on, 16 hours of growth light every day, 1 3 seconds of water pump which is around 59.6ml of water, everyday once at 12pm. </w:t>
+      </w:r>
+    </w:p>
+    <w:p>
+      <w:pPr>
+        <w:rPr>
+          <w:lang w:val="en-US"/>
+        </w:rPr>
+      </w:pPr>
+      <w:r>
+        <w:rPr>
+          <w:lang w:val="en-US"/>
+        </w:rPr>
+        <w:lastRenderedPageBreak/>
+        <w:t xml:space="preserve">The water moisture value is </w:t>
+      </w:r>
+      <w:proofErr w:type="spellStart"/>
+      <w:r>
+        <w:rPr>
+          <w:lang w:val="en-US"/>
+        </w:rPr>
+        <w:t>sittin</w:t>
+      </w:r>
+      <w:proofErr w:type="spellEnd"/>
+      <w:r>
+        <w:rPr>
+          <w:lang w:val="en-US"/>
+        </w:rPr>
+        <w:t xml:space="preserve"> at 46, constantly, which is surprising. </w:t>
+      </w:r>
+    </w:p>
+    <w:p>
+      <w:pPr>
+        <w:rPr>
+          <w:lang w:val="en-US"/>
+        </w:rPr>
+      </w:pPr>
+      <w:r>
+        <w:rPr>
+          <w:lang w:val="en-US"/>
+        </w:rPr>
+        <w:t xml:space="preserve">I was estimating that the moisture value would be about 50 for water soil moisture growth to occur. That is something which I would like to solve, raising the soil moisture from 46 to 50, and seeing results. If plant growth accelerates, than 50 would become the ideal value. </w:t>
+      </w:r>
+    </w:p>
+    <w:p>
+      <w:pPr>
+        <w:rPr>
+          <w:lang w:val="en-US"/>
+        </w:rPr>
+      </w:pPr>
+      <w:r>
+        <w:rPr>
+          <w:lang w:val="en-US"/>
+        </w:rPr>
+        <w:t xml:space="preserve">I would also see what the deeper sensor value would be, the shallow sensor is the main sensor. </w:t>
       </w:r>
     </w:p>
     <w:p>

</xml_diff>